<commit_message>
added 2 comments for simona in draft
</commit_message>
<xml_diff>
--- a/4_drafts/Draft5/Martyn_etal_Draft5_AM_NEW_short.docx
+++ b/4_drafts/Draft5/Martyn_etal_Draft5_AM_NEW_short.docx
@@ -1298,7 +1298,6 @@
           <w:rFonts w:ascii="Times New Roman" w:hAnsi="Times New Roman" w:cs="Times New Roman"/>
           <w:b/>
           <w:bCs/>
-          <w:highlight w:val="green"/>
         </w:rPr>
         <w:lastRenderedPageBreak/>
         <w:t>Introduction</w:t>
@@ -5468,7 +5467,6 @@
           <w:rFonts w:ascii="Times New Roman" w:hAnsi="Times New Roman" w:cs="Times New Roman"/>
           <w:b/>
           <w:bCs/>
-          <w:highlight w:val="green"/>
         </w:rPr>
       </w:pPr>
       <w:r>
@@ -5476,7 +5474,6 @@
           <w:rFonts w:ascii="Times New Roman" w:hAnsi="Times New Roman" w:cs="Times New Roman"/>
           <w:b/>
           <w:bCs/>
-          <w:highlight w:val="green"/>
         </w:rPr>
         <w:t>Results</w:t>
       </w:r>
@@ -5496,7 +5493,6 @@
           <w:rFonts w:ascii="Times New Roman" w:hAnsi="Times New Roman" w:cs="Times New Roman"/>
           <w:b/>
           <w:bCs/>
-          <w:highlight w:val="green"/>
         </w:rPr>
         <w:t xml:space="preserve">Long-term effects of soil fertilisation on </w:t>
       </w:r>
@@ -5505,7 +5501,6 @@
           <w:rFonts w:ascii="Times New Roman" w:hAnsi="Times New Roman" w:cs="Times New Roman"/>
           <w:b/>
           <w:bCs/>
-          <w:highlight w:val="green"/>
         </w:rPr>
         <w:t>soil</w:t>
       </w:r>
@@ -5514,7 +5509,6 @@
           <w:rFonts w:ascii="Times New Roman" w:hAnsi="Times New Roman" w:cs="Times New Roman"/>
           <w:b/>
           <w:bCs/>
-          <w:highlight w:val="green"/>
         </w:rPr>
         <w:t xml:space="preserve"> </w:t>
       </w:r>
@@ -5523,7 +5517,6 @@
           <w:rFonts w:ascii="Times New Roman" w:hAnsi="Times New Roman" w:cs="Times New Roman"/>
           <w:b/>
           <w:bCs/>
-          <w:highlight w:val="green"/>
         </w:rPr>
         <w:t>bacterial</w:t>
       </w:r>
@@ -5532,7 +5525,6 @@
           <w:rFonts w:ascii="Times New Roman" w:hAnsi="Times New Roman" w:cs="Times New Roman"/>
           <w:b/>
           <w:bCs/>
-          <w:highlight w:val="green"/>
         </w:rPr>
         <w:t xml:space="preserve"> communities</w:t>
       </w:r>
@@ -6848,7 +6840,6 @@
           <w:rFonts w:ascii="Times New Roman" w:hAnsi="Times New Roman" w:cs="Times New Roman"/>
           <w:b/>
           <w:bCs/>
-          <w:highlight w:val="green"/>
         </w:rPr>
         <w:t xml:space="preserve">Host-specific </w:t>
       </w:r>
@@ -6857,7 +6848,6 @@
           <w:rFonts w:ascii="Times New Roman" w:hAnsi="Times New Roman" w:cs="Times New Roman"/>
           <w:b/>
           <w:bCs/>
-          <w:highlight w:val="green"/>
         </w:rPr>
         <w:t xml:space="preserve">colonisation </w:t>
       </w:r>
@@ -6866,7 +6856,6 @@
           <w:rFonts w:ascii="Times New Roman" w:hAnsi="Times New Roman" w:cs="Times New Roman"/>
           <w:b/>
           <w:bCs/>
-          <w:highlight w:val="green"/>
         </w:rPr>
         <w:t>by</w:t>
       </w:r>
@@ -6875,7 +6864,6 @@
           <w:rFonts w:ascii="Times New Roman" w:hAnsi="Times New Roman" w:cs="Times New Roman"/>
           <w:b/>
           <w:bCs/>
-          <w:highlight w:val="green"/>
         </w:rPr>
         <w:t xml:space="preserve"> </w:t>
       </w:r>
@@ -6884,7 +6872,6 @@
           <w:rFonts w:ascii="Times New Roman" w:hAnsi="Times New Roman" w:cs="Times New Roman"/>
           <w:b/>
           <w:bCs/>
-          <w:highlight w:val="green"/>
         </w:rPr>
         <w:t>distinct</w:t>
       </w:r>
@@ -6893,7 +6880,6 @@
           <w:rFonts w:ascii="Times New Roman" w:hAnsi="Times New Roman" w:cs="Times New Roman"/>
           <w:b/>
           <w:bCs/>
-          <w:highlight w:val="green"/>
         </w:rPr>
         <w:t xml:space="preserve"> </w:t>
       </w:r>
@@ -6902,7 +6888,6 @@
           <w:rFonts w:ascii="Times New Roman" w:hAnsi="Times New Roman" w:cs="Times New Roman"/>
           <w:b/>
           <w:bCs/>
-          <w:highlight w:val="green"/>
         </w:rPr>
         <w:t xml:space="preserve">soil </w:t>
       </w:r>
@@ -6911,7 +6896,6 @@
           <w:rFonts w:ascii="Times New Roman" w:hAnsi="Times New Roman" w:cs="Times New Roman"/>
           <w:b/>
           <w:bCs/>
-          <w:highlight w:val="green"/>
         </w:rPr>
         <w:t xml:space="preserve">microbiota </w:t>
       </w:r>
@@ -6920,7 +6904,6 @@
           <w:rFonts w:ascii="Times New Roman" w:hAnsi="Times New Roman" w:cs="Times New Roman"/>
           <w:b/>
           <w:bCs/>
-          <w:highlight w:val="green"/>
         </w:rPr>
         <w:t>members</w:t>
       </w:r>
@@ -9027,7 +9010,6 @@
           <w:rFonts w:ascii="Times New Roman" w:hAnsi="Times New Roman" w:cs="Times New Roman"/>
           <w:b/>
           <w:bCs/>
-          <w:highlight w:val="green"/>
         </w:rPr>
         <w:t xml:space="preserve">High accuracy </w:t>
       </w:r>
@@ -9036,7 +9018,6 @@
           <w:rFonts w:ascii="Times New Roman" w:hAnsi="Times New Roman" w:cs="Times New Roman"/>
           <w:b/>
           <w:bCs/>
-          <w:highlight w:val="green"/>
         </w:rPr>
         <w:t xml:space="preserve">prediction of plant </w:t>
       </w:r>
@@ -9045,7 +9026,6 @@
           <w:rFonts w:ascii="Times New Roman" w:hAnsi="Times New Roman" w:cs="Times New Roman"/>
           <w:b/>
           <w:bCs/>
-          <w:highlight w:val="green"/>
         </w:rPr>
         <w:t>nutrient status based on bacterial</w:t>
       </w:r>
@@ -9054,7 +9034,6 @@
           <w:rFonts w:ascii="Times New Roman" w:hAnsi="Times New Roman" w:cs="Times New Roman"/>
           <w:b/>
           <w:bCs/>
-          <w:highlight w:val="green"/>
         </w:rPr>
         <w:t xml:space="preserve"> community </w:t>
       </w:r>
@@ -9063,7 +9042,6 @@
           <w:rFonts w:ascii="Times New Roman" w:hAnsi="Times New Roman" w:cs="Times New Roman"/>
           <w:b/>
           <w:bCs/>
-          <w:highlight w:val="green"/>
         </w:rPr>
         <w:t>compositions</w:t>
       </w:r>
@@ -10327,7 +10305,6 @@
           <w:rFonts w:ascii="Times New Roman" w:hAnsi="Times New Roman" w:cs="Times New Roman"/>
           <w:b/>
           <w:bCs/>
-          <w:highlight w:val="green"/>
         </w:rPr>
         <w:t>Impai</w:t>
       </w:r>
@@ -10336,7 +10313,6 @@
           <w:rFonts w:ascii="Times New Roman" w:hAnsi="Times New Roman" w:cs="Times New Roman"/>
           <w:b/>
           <w:bCs/>
-          <w:highlight w:val="green"/>
         </w:rPr>
         <w:t>rment of</w:t>
       </w:r>
@@ -10345,7 +10321,6 @@
           <w:rFonts w:ascii="Times New Roman" w:hAnsi="Times New Roman" w:cs="Times New Roman"/>
           <w:b/>
           <w:bCs/>
-          <w:highlight w:val="green"/>
         </w:rPr>
         <w:t xml:space="preserve"> symbiosis signalling </w:t>
       </w:r>
@@ -10354,7 +10329,6 @@
           <w:rFonts w:ascii="Times New Roman" w:hAnsi="Times New Roman" w:cs="Times New Roman"/>
           <w:b/>
           <w:bCs/>
-          <w:highlight w:val="green"/>
         </w:rPr>
         <w:t xml:space="preserve">genes </w:t>
       </w:r>
@@ -10363,7 +10337,6 @@
           <w:rFonts w:ascii="Times New Roman" w:hAnsi="Times New Roman" w:cs="Times New Roman"/>
           <w:b/>
           <w:bCs/>
-          <w:highlight w:val="green"/>
         </w:rPr>
         <w:t>alters microbiome assemblies</w:t>
       </w:r>
@@ -13169,7 +13142,6 @@
           <w:rFonts w:ascii="Times New Roman" w:hAnsi="Times New Roman" w:cs="Times New Roman"/>
           <w:b/>
           <w:bCs/>
-          <w:highlight w:val="green"/>
         </w:rPr>
         <w:t>Symbiosis signalling pathways can be linked to differential root exudation in both</w:t>
       </w:r>
@@ -13179,7 +13151,6 @@
           <w:rFonts w:ascii="Times New Roman" w:hAnsi="Times New Roman" w:cs="Times New Roman"/>
           <w:b/>
           <w:bCs/>
-          <w:highlight w:val="green"/>
         </w:rPr>
         <w:t xml:space="preserve"> hosts</w:t>
       </w:r>
@@ -13217,7 +13188,13 @@
         <w:rPr>
           <w:rFonts w:ascii="Times New Roman" w:hAnsi="Times New Roman" w:cs="Times New Roman"/>
         </w:rPr>
-        <w:t>soil interface, forming a diverse chemical pool that fosters microbial competition and cooperation</w:t>
+        <w:t>soil interface, forming a diverse</w:t>
+      </w:r>
+      <w:r>
+        <w:rPr>
+          <w:rFonts w:ascii="Times New Roman" w:hAnsi="Times New Roman" w:cs="Times New Roman"/>
+        </w:rPr>
+        <w:t xml:space="preserve"> chemical pool that fosters microbial competition and cooperation</w:t>
       </w:r>
       <w:r>
         <w:rPr>
@@ -13457,6 +13434,7 @@
         </w:rPr>
         <w:t>(</w:t>
       </w:r>
+      <w:commentRangeStart w:id="13"/>
       <w:r>
         <w:rPr>
           <w:rFonts w:ascii="Times New Roman" w:hAnsi="Times New Roman" w:cs="Times New Roman"/>
@@ -13477,6 +13455,13 @@
           <w:highlight w:val="magenta"/>
         </w:rPr>
         <w:t>5A</w:t>
+      </w:r>
+      <w:commentRangeEnd w:id="13"/>
+      <w:r>
+        <w:rPr>
+          <w:rStyle w:val="CommentReference"/>
+        </w:rPr>
+        <w:commentReference w:id="13"/>
       </w:r>
       <w:r>
         <w:rPr>
@@ -13574,7 +13559,7 @@
           <w:rFonts w:ascii="Times New Roman" w:hAnsi="Times New Roman" w:cs="Times New Roman"/>
         </w:rPr>
       </w:pPr>
-      <w:commentRangeStart w:id="13"/>
+      <w:commentRangeStart w:id="14"/>
       <w:r>
         <w:rPr>
           <w:rFonts w:ascii="Times New Roman" w:hAnsi="Times New Roman" w:cs="Times New Roman"/>
@@ -13643,12 +13628,12 @@
         </w:rPr>
         <w:t xml:space="preserve"> </w:t>
       </w:r>
-      <w:commentRangeEnd w:id="13"/>
+      <w:commentRangeEnd w:id="14"/>
       <w:r>
         <w:rPr>
           <w:rStyle w:val="CommentReference"/>
         </w:rPr>
-        <w:commentReference w:id="13"/>
+        <w:commentReference w:id="14"/>
       </w:r>
       <w:r>
         <w:rPr>
@@ -15229,7 +15214,6 @@
           <w:rFonts w:ascii="Times New Roman" w:hAnsi="Times New Roman" w:cs="Times New Roman"/>
           <w:b/>
           <w:bCs/>
-          <w:highlight w:val="green"/>
         </w:rPr>
         <w:lastRenderedPageBreak/>
         <w:t>Community shifts were replicated in gnotobiotic systems with synthetic bacterial communities</w:t>
@@ -17158,19 +17142,19 @@
         </w:rPr>
         <w:t xml:space="preserve"> </w:t>
       </w:r>
-      <w:commentRangeStart w:id="14"/>
+      <w:commentRangeStart w:id="15"/>
       <w:r>
         <w:rPr>
           <w:rFonts w:ascii="Times New Roman" w:hAnsi="Times New Roman" w:cs="Times New Roman"/>
         </w:rPr>
         <w:t>65%</w:t>
       </w:r>
-      <w:commentRangeEnd w:id="14"/>
+      <w:commentRangeEnd w:id="15"/>
       <w:r>
         <w:rPr>
           <w:rStyle w:val="CommentReference"/>
         </w:rPr>
-        <w:commentReference w:id="14"/>
+        <w:commentReference w:id="15"/>
       </w:r>
       <w:r>
         <w:rPr>
@@ -18584,7 +18568,6 @@
           <w:rFonts w:ascii="Times New Roman" w:hAnsi="Times New Roman" w:cs="Times New Roman"/>
           <w:b/>
           <w:bCs/>
-          <w:highlight w:val="green"/>
         </w:rPr>
         <w:t>Discussion</w:t>
       </w:r>
@@ -18737,7 +18720,6 @@
       <w:r>
         <w:rPr>
           <w:rFonts w:ascii="Times New Roman" w:hAnsi="Times New Roman" w:cs="Times New Roman"/>
-          <w:highlight w:val="green"/>
           <w:u w:val="single"/>
         </w:rPr>
         <w:t>Soil legacy and microbial recruitment</w:t>
@@ -18950,19 +18932,7 @@
         <w:rPr>
           <w:rFonts w:ascii="Times New Roman" w:hAnsi="Times New Roman" w:cs="Times New Roman"/>
         </w:rPr>
-        <w:t xml:space="preserve"> </w:t>
-      </w:r>
-      <w:r>
-        <w:rPr>
-          <w:rFonts w:ascii="Times New Roman" w:hAnsi="Times New Roman" w:cs="Times New Roman"/>
-        </w:rPr>
-        <w:t>(Kong 2023, Hallin</w:t>
-      </w:r>
-      <w:r>
-        <w:rPr>
-          <w:rFonts w:ascii="Times New Roman" w:hAnsi="Times New Roman" w:cs="Times New Roman"/>
-        </w:rPr>
-        <w:t xml:space="preserve"> 2009, Wang 2024, Hannula 2021). </w:t>
+        <w:t xml:space="preserve"> (Kong 2023, Hallin 2009, Wang 2024, Hannula 2021). </w:t>
       </w:r>
       <w:r>
         <w:rPr>
@@ -19084,7 +19054,14 @@
           <w:rFonts w:ascii="Times New Roman" w:hAnsi="Times New Roman" w:cs="Times New Roman"/>
           <w:color w:val="000000" w:themeColor="text1"/>
         </w:rPr>
-        <w:t>contrasting soils. These results support the emerging concept that plant-</w:t>
+        <w:t>contrasting soils. These results support the</w:t>
+      </w:r>
+      <w:r>
+        <w:rPr>
+          <w:rFonts w:ascii="Times New Roman" w:hAnsi="Times New Roman" w:cs="Times New Roman"/>
+          <w:color w:val="000000" w:themeColor="text1"/>
+        </w:rPr>
+        <w:t xml:space="preserve"> emerging concept that plant-</w:t>
       </w:r>
       <w:r>
         <w:rPr>
@@ -26915,7 +26892,7 @@
         </w:rPr>
         <w:t xml:space="preserve">, </w:t>
       </w:r>
-      <w:commentRangeStart w:id="15"/>
+      <w:commentRangeStart w:id="16"/>
       <w:r>
         <w:rPr>
           <w:rFonts w:ascii="Times New Roman" w:hAnsi="Times New Roman" w:cs="Times New Roman"/>
@@ -26923,12 +26900,12 @@
         </w:rPr>
         <w:t>reference</w:t>
       </w:r>
-      <w:commentRangeEnd w:id="15"/>
+      <w:commentRangeEnd w:id="16"/>
       <w:r>
         <w:rPr>
           <w:rStyle w:val="CommentReference"/>
         </w:rPr>
-        <w:commentReference w:id="15"/>
+        <w:commentReference w:id="16"/>
       </w:r>
       <w:r>
         <w:rPr>
@@ -26997,7 +26974,7 @@
         </w:rPr>
         <w:t>[</w:t>
       </w:r>
-      <w:commentRangeStart w:id="16"/>
+      <w:commentRangeStart w:id="17"/>
       <w:r>
         <w:rPr>
           <w:rFonts w:ascii="Times New Roman" w:hAnsi="Times New Roman" w:cs="Times New Roman"/>
@@ -27005,12 +26982,12 @@
         </w:rPr>
         <w:t>REF</w:t>
       </w:r>
-      <w:commentRangeEnd w:id="16"/>
+      <w:commentRangeEnd w:id="17"/>
       <w:r>
         <w:rPr>
           <w:rStyle w:val="CommentReference"/>
         </w:rPr>
-        <w:commentReference w:id="16"/>
+        <w:commentReference w:id="17"/>
       </w:r>
       <w:r>
         <w:rPr>
@@ -27071,7 +27048,7 @@
         </w:rPr>
         <w:t xml:space="preserve"> [</w:t>
       </w:r>
-      <w:commentRangeStart w:id="17"/>
+      <w:commentRangeStart w:id="18"/>
       <w:r>
         <w:rPr>
           <w:rFonts w:ascii="Times New Roman" w:hAnsi="Times New Roman" w:cs="Times New Roman"/>
@@ -27079,12 +27056,12 @@
         </w:rPr>
         <w:t>REF</w:t>
       </w:r>
-      <w:commentRangeEnd w:id="17"/>
+      <w:commentRangeEnd w:id="18"/>
       <w:r>
         <w:rPr>
           <w:rStyle w:val="CommentReference"/>
         </w:rPr>
-        <w:commentReference w:id="17"/>
+        <w:commentReference w:id="18"/>
       </w:r>
       <w:r>
         <w:rPr>
@@ -27130,7 +27107,7 @@
         </w:rPr>
         <w:t xml:space="preserve"> [</w:t>
       </w:r>
-      <w:commentRangeStart w:id="18"/>
+      <w:commentRangeStart w:id="19"/>
       <w:r>
         <w:rPr>
           <w:rFonts w:ascii="Times New Roman" w:hAnsi="Times New Roman" w:cs="Times New Roman"/>
@@ -27138,13 +27115,13 @@
         </w:rPr>
         <w:t>REF</w:t>
       </w:r>
-      <w:commentRangeEnd w:id="18"/>
+      <w:commentRangeEnd w:id="19"/>
       <w:r>
         <w:rPr>
           <w:rStyle w:val="CommentReference"/>
           <w:highlight w:val="red"/>
         </w:rPr>
-        <w:commentReference w:id="18"/>
+        <w:commentReference w:id="19"/>
       </w:r>
       <w:r>
         <w:rPr>
@@ -27466,7 +27443,7 @@
         </w:rPr>
         <w:t>[</w:t>
       </w:r>
-      <w:commentRangeStart w:id="19"/>
+      <w:commentRangeStart w:id="20"/>
       <w:r>
         <w:rPr>
           <w:rFonts w:ascii="Times New Roman" w:hAnsi="Times New Roman" w:cs="Times New Roman"/>
@@ -27474,12 +27451,12 @@
         </w:rPr>
         <w:t>REF</w:t>
       </w:r>
-      <w:commentRangeEnd w:id="19"/>
+      <w:commentRangeEnd w:id="20"/>
       <w:r>
         <w:rPr>
           <w:rStyle w:val="CommentReference"/>
         </w:rPr>
-        <w:commentReference w:id="19"/>
+        <w:commentReference w:id="20"/>
       </w:r>
       <w:r>
         <w:rPr>
@@ -27537,7 +27514,7 @@
         </w:rPr>
         <w:t>. [</w:t>
       </w:r>
-      <w:commentRangeStart w:id="20"/>
+      <w:commentRangeStart w:id="21"/>
       <w:r>
         <w:rPr>
           <w:rFonts w:ascii="Times New Roman" w:hAnsi="Times New Roman" w:cs="Times New Roman"/>
@@ -27545,12 +27522,12 @@
         </w:rPr>
         <w:t>REF</w:t>
       </w:r>
-      <w:commentRangeEnd w:id="20"/>
+      <w:commentRangeEnd w:id="21"/>
       <w:r>
         <w:rPr>
           <w:rStyle w:val="CommentReference"/>
         </w:rPr>
-        <w:commentReference w:id="20"/>
+        <w:commentReference w:id="21"/>
       </w:r>
       <w:r>
         <w:rPr>
@@ -27636,7 +27613,7 @@
         </w:rPr>
         <w:t xml:space="preserve"> [</w:t>
       </w:r>
-      <w:commentRangeStart w:id="21"/>
+      <w:commentRangeStart w:id="22"/>
       <w:r>
         <w:rPr>
           <w:rFonts w:ascii="Times New Roman" w:hAnsi="Times New Roman" w:cs="Times New Roman"/>
@@ -27644,12 +27621,12 @@
         </w:rPr>
         <w:t>REF</w:t>
       </w:r>
-      <w:commentRangeEnd w:id="21"/>
+      <w:commentRangeEnd w:id="22"/>
       <w:r>
         <w:rPr>
           <w:rStyle w:val="CommentReference"/>
         </w:rPr>
-        <w:commentReference w:id="21"/>
+        <w:commentReference w:id="22"/>
       </w:r>
       <w:r>
         <w:rPr>
@@ -28205,7 +28182,7 @@
         </w:rPr>
         <w:t xml:space="preserve">) </w:t>
       </w:r>
-      <w:commentRangeStart w:id="22"/>
+      <w:commentRangeStart w:id="23"/>
       <w:r>
         <w:rPr>
           <w:rFonts w:ascii="Times New Roman" w:hAnsi="Times New Roman" w:cs="Times New Roman"/>
@@ -28231,9 +28208,9 @@
         </w:rPr>
         <w:t>]</w:t>
       </w:r>
-      <w:commentRangeEnd w:id="22"/>
-      <w:r>
-        <w:commentReference w:id="22"/>
+      <w:commentRangeEnd w:id="23"/>
+      <w:r>
+        <w:commentReference w:id="23"/>
       </w:r>
       <w:r>
         <w:rPr>
@@ -30994,7 +30971,7 @@
         </w:rPr>
         <w:t xml:space="preserve"> Tobit regression </w:t>
       </w:r>
-      <w:commentRangeStart w:id="23"/>
+      <w:commentRangeStart w:id="24"/>
       <w:r>
         <w:rPr>
           <w:rFonts w:ascii="Times New Roman" w:hAnsi="Times New Roman" w:cs="Times New Roman"/>
@@ -31017,9 +30994,9 @@
         </w:rPr>
         <w:t>]</w:t>
       </w:r>
-      <w:commentRangeEnd w:id="23"/>
-      <w:r>
-        <w:commentReference w:id="23"/>
+      <w:commentRangeEnd w:id="24"/>
+      <w:r>
+        <w:commentReference w:id="24"/>
       </w:r>
       <w:r>
         <w:rPr>
@@ -31133,7 +31110,7 @@
         </w:rPr>
         <w:t xml:space="preserve">nalysis (PCA) </w:t>
       </w:r>
-      <w:commentRangeStart w:id="24"/>
+      <w:commentRangeStart w:id="25"/>
       <w:r>
         <w:rPr>
           <w:rFonts w:ascii="Times New Roman" w:hAnsi="Times New Roman" w:cs="Times New Roman"/>
@@ -31141,7 +31118,7 @@
         </w:rPr>
         <w:t>[</w:t>
       </w:r>
-      <w:commentRangeEnd w:id="24"/>
+      <w:commentRangeEnd w:id="25"/>
       <w:r>
         <w:rPr>
           <w:rFonts w:ascii="Times New Roman" w:hAnsi="Times New Roman" w:cs="Times New Roman"/>
@@ -31158,7 +31135,7 @@
         <w:t>]</w:t>
       </w:r>
       <w:r>
-        <w:commentReference w:id="24"/>
+        <w:commentReference w:id="25"/>
       </w:r>
       <w:r>
         <w:rPr>
@@ -31279,7 +31256,7 @@
         </w:rPr>
         <w:t xml:space="preserve">. </w:t>
       </w:r>
-      <w:commentRangeStart w:id="25"/>
+      <w:commentRangeStart w:id="26"/>
       <w:r>
         <w:rPr>
           <w:rFonts w:ascii="Times New Roman" w:hAnsi="Times New Roman" w:cs="Times New Roman"/>
@@ -31303,12 +31280,12 @@
         </w:rPr>
         <w:t xml:space="preserve"> class, where only classes with at least two metabolites are differentially exudated in at least one mutant compared to WT</w:t>
       </w:r>
-      <w:commentRangeEnd w:id="25"/>
+      <w:commentRangeEnd w:id="26"/>
       <w:r>
         <w:rPr>
           <w:rStyle w:val="CommentReference"/>
         </w:rPr>
-        <w:commentReference w:id="25"/>
+        <w:commentReference w:id="26"/>
       </w:r>
       <w:r>
         <w:rPr>
@@ -32227,7 +32204,13 @@
         <w:annotationRef/>
       </w:r>
       <w:r>
-        <w:t>Do we need an additional figure that shows the abundance of the nodule ASVs (detected earlier in WT suppl. Figure) across WT and mutant root compartment, or is it sufficient to leave it as is?</w:t>
+        <w:t>Do we need an additional figure that shows the abundance of the nodule ASVs (detected earlier in WT suppl. Figure</w:t>
+      </w:r>
+      <w:r>
+        <w:t xml:space="preserve"> 1</w:t>
+      </w:r>
+      <w:r>
+        <w:t>) across WT and mutant root compartment, or is it sufficient to leave it as is?</w:t>
       </w:r>
     </w:p>
   </w:comment>
@@ -32322,7 +32305,7 @@
       </w:r>
     </w:p>
   </w:comment>
-  <w:comment w:id="13" w:author="Anna Marie Martyn" w:date="2026-01-05T22:27:00Z" w:initials="AMM">
+  <w:comment w:id="13" w:author="Anna Marie Martyn" w:date="2026-01-12T11:48:00Z" w:initials="AMM">
     <w:p>
       <w:pPr>
         <w:pStyle w:val="CommentText"/>
@@ -32334,30 +32317,11 @@
         <w:annotationRef/>
       </w:r>
       <w:r>
-        <w:t xml:space="preserve">Necessary to show differences at pathway level? If so, @Ib could you double check that with the new analysis we still don’t have any significant differences at the pathway level for </w:t>
-      </w:r>
-      <w:proofErr w:type="gramStart"/>
-      <w:r>
-        <w:t>Hordeum?</w:t>
-      </w:r>
-      <w:r>
-        <w:t>;</w:t>
-      </w:r>
-      <w:proofErr w:type="gramEnd"/>
-      <w:r>
-        <w:t xml:space="preserve"> also @ </w:t>
-      </w:r>
-      <w:proofErr w:type="spellStart"/>
-      <w:r>
-        <w:t>Ib</w:t>
-      </w:r>
-      <w:proofErr w:type="spellEnd"/>
-      <w:r>
-        <w:t xml:space="preserve"> could you check the pathway names again with the new classifier that we used for panel C also?</w:t>
+        <w:t>@ Simona, this suppl. figure is currently missing</w:t>
       </w:r>
     </w:p>
   </w:comment>
-  <w:comment w:id="14" w:author="Anna Marie Martyn" w:date="2026-01-06T13:49:00Z" w:initials="AMM">
+  <w:comment w:id="14" w:author="Anna Marie Martyn" w:date="2026-01-05T22:27:00Z" w:initials="AMM">
     <w:p>
       <w:pPr>
         <w:pStyle w:val="CommentText"/>
@@ -32369,11 +32333,62 @@
         <w:annotationRef/>
       </w:r>
       <w:r>
-        <w:t>@Ib check correct percentage</w:t>
+        <w:t xml:space="preserve">Necessary to show differences at pathway level? If so, @Ib could you double check that with the new analysis we still don’t have any significant differences at the pathway level for </w:t>
+      </w:r>
+      <w:proofErr w:type="gramStart"/>
+      <w:r>
+        <w:t>Hordeum?</w:t>
+      </w:r>
+      <w:r>
+        <w:t>;</w:t>
+      </w:r>
+      <w:proofErr w:type="gramEnd"/>
+      <w:r>
+        <w:t xml:space="preserve"> also @ </w:t>
+      </w:r>
+      <w:proofErr w:type="spellStart"/>
+      <w:r>
+        <w:t>Ib</w:t>
+      </w:r>
+      <w:proofErr w:type="spellEnd"/>
+      <w:r>
+        <w:t xml:space="preserve"> could you check the pathway names again with the new classifier that we used for panel C also?</w:t>
+      </w:r>
+      <w:r>
+        <w:t>;</w:t>
+      </w:r>
+    </w:p>
+    <w:p>
+      <w:pPr>
+        <w:pStyle w:val="CommentText"/>
+      </w:pPr>
+    </w:p>
+    <w:p>
+      <w:pPr>
+        <w:pStyle w:val="CommentText"/>
+      </w:pPr>
+      <w:r>
+        <w:t>@Simona, this supplementary figure is currently missing</w:t>
       </w:r>
     </w:p>
   </w:comment>
-  <w:comment w:id="15" w:author="Anna Marie Martyn" w:date="2025-12-23T11:24:00Z" w:initials="AMM">
+  <w:comment w:id="15" w:author="Anna Marie Martyn" w:date="2026-01-06T13:49:00Z" w:initials="AMM">
+    <w:p>
+      <w:pPr>
+        <w:pStyle w:val="CommentText"/>
+      </w:pPr>
+      <w:r>
+        <w:rPr>
+          <w:rStyle w:val="CommentReference"/>
+        </w:rPr>
+        <w:annotationRef/>
+      </w:r>
+      <w:r>
+        <w:t>@Ib check correct percentage</w:t>
+      </w:r>
+    </w:p>
+  </w:comment>
+  <w:comment w:id="16" w:author="Anna Marie Martyn" w:date="2025-12-23T11:24:00Z" w:initials="AMM">
     <w:p>
       <w:r>
         <w:rPr>
@@ -32429,7 +32444,7 @@
       </w:pPr>
     </w:p>
   </w:comment>
-  <w:comment w:id="16" w:author="Anna Marie Martyn" w:date="2025-12-23T11:24:00Z" w:initials="AMM">
+  <w:comment w:id="17" w:author="Anna Marie Martyn" w:date="2025-12-23T11:24:00Z" w:initials="AMM">
     <w:p>
       <w:r>
         <w:rPr>
@@ -32467,7 +32482,7 @@
       </w:r>
     </w:p>
   </w:comment>
-  <w:comment w:id="17" w:author="Anna Marie Martyn" w:date="2025-12-23T11:27:00Z" w:initials="AMM">
+  <w:comment w:id="18" w:author="Anna Marie Martyn" w:date="2025-12-23T11:27:00Z" w:initials="AMM">
     <w:p>
       <w:r>
         <w:rPr>
@@ -32505,7 +32520,7 @@
       </w:r>
     </w:p>
   </w:comment>
-  <w:comment w:id="18" w:author="Anna Marie Martyn" w:date="2025-12-23T11:25:00Z" w:initials="AMM">
+  <w:comment w:id="19" w:author="Anna Marie Martyn" w:date="2025-12-23T11:25:00Z" w:initials="AMM">
     <w:p>
       <w:r>
         <w:rPr>
@@ -32563,7 +32578,7 @@
       </w:r>
     </w:p>
   </w:comment>
-  <w:comment w:id="19" w:author="Anna Marie Martyn" w:date="2025-12-23T11:28:00Z" w:initials="AMM">
+  <w:comment w:id="20" w:author="Anna Marie Martyn" w:date="2025-12-23T11:28:00Z" w:initials="AMM">
     <w:p>
       <w:r>
         <w:rPr>
@@ -32601,7 +32616,7 @@
       </w:r>
     </w:p>
   </w:comment>
-  <w:comment w:id="20" w:author="Anna Marie Martyn" w:date="2025-12-23T11:29:00Z" w:initials="AMM">
+  <w:comment w:id="21" w:author="Anna Marie Martyn" w:date="2025-12-23T11:29:00Z" w:initials="AMM">
     <w:p>
       <w:r>
         <w:rPr>
@@ -32639,7 +32654,7 @@
       </w:r>
     </w:p>
   </w:comment>
-  <w:comment w:id="21" w:author="Anna Marie Martyn" w:date="2025-12-23T11:30:00Z" w:initials="AMM">
+  <w:comment w:id="22" w:author="Anna Marie Martyn" w:date="2025-12-23T11:30:00Z" w:initials="AMM">
     <w:p>
       <w:r>
         <w:rPr>
@@ -32684,7 +32699,7 @@
       </w:r>
     </w:p>
   </w:comment>
-  <w:comment w:id="22" w:author="Unknown Author" w:date="2025-11-21T11:55:00Z" w:initials="">
+  <w:comment w:id="23" w:author="Unknown Author" w:date="2025-11-21T11:55:00Z" w:initials="">
     <w:p>
       <w:r>
         <w:rPr>
@@ -32713,7 +32728,7 @@
       </w:r>
     </w:p>
   </w:comment>
-  <w:comment w:id="23" w:author="Unknown Author" w:date="2025-11-24T08:58:00Z" w:initials="">
+  <w:comment w:id="24" w:author="Unknown Author" w:date="2025-11-24T08:58:00Z" w:initials="">
     <w:p>
       <w:r>
         <w:rPr>
@@ -32758,7 +32773,7 @@
       </w:r>
     </w:p>
   </w:comment>
-  <w:comment w:id="24" w:author="Unknown Author" w:date="2025-11-24T08:37:00Z" w:initials="">
+  <w:comment w:id="25" w:author="Unknown Author" w:date="2025-11-24T08:37:00Z" w:initials="">
     <w:p>
       <w:r>
         <w:rPr>
@@ -32803,7 +32818,7 @@
       </w:r>
     </w:p>
   </w:comment>
-  <w:comment w:id="25" w:author="Anna Marie Martyn" w:date="2025-12-23T12:12:00Z" w:initials="AMM">
+  <w:comment w:id="26" w:author="Anna Marie Martyn" w:date="2025-12-23T12:12:00Z" w:initials="AMM">
     <w:p>
       <w:pPr>
         <w:pStyle w:val="CommentText"/>
@@ -32837,6 +32852,7 @@
   <w15:commentEx w15:paraId="765EB21D" w15:done="0"/>
   <w15:commentEx w15:paraId="46CE2669" w15:done="0"/>
   <w15:commentEx w15:paraId="738C1ACF" w15:done="0"/>
+  <w15:commentEx w15:paraId="20807F32" w15:done="0"/>
   <w15:commentEx w15:paraId="4BE2C4AC" w15:done="0"/>
   <w15:commentEx w15:paraId="6DE6B53B" w15:done="0"/>
   <w15:commentEx w15:paraId="243DA3ED" w15:done="0"/>
@@ -32868,6 +32884,7 @@
   <w16cex:commentExtensible w16cex:durableId="2DFD2301" w16cex:dateUtc="2026-01-05T22:55:00Z"/>
   <w16cex:commentExtensible w16cex:durableId="7382F0E8" w16cex:dateUtc="2026-01-05T21:22:00Z"/>
   <w16cex:commentExtensible w16cex:durableId="4DD69407" w16cex:dateUtc="2026-01-05T22:40:00Z"/>
+  <w16cex:commentExtensible w16cex:durableId="63824A18" w16cex:dateUtc="2026-01-12T10:48:00Z"/>
   <w16cex:commentExtensible w16cex:durableId="3CE12808" w16cex:dateUtc="2026-01-05T21:27:00Z"/>
   <w16cex:commentExtensible w16cex:durableId="25613EB9" w16cex:dateUtc="2026-01-06T12:49:00Z"/>
   <w16cex:commentExtensible w16cex:durableId="16D152E9" w16cex:dateUtc="2025-12-23T10:24:00Z"/>
@@ -32896,6 +32913,7 @@
   <w16cid:commentId w16cid:paraId="765EB21D" w16cid:durableId="2DFD2301"/>
   <w16cid:commentId w16cid:paraId="46CE2669" w16cid:durableId="7382F0E8"/>
   <w16cid:commentId w16cid:paraId="738C1ACF" w16cid:durableId="4DD69407"/>
+  <w16cid:commentId w16cid:paraId="20807F32" w16cid:durableId="63824A18"/>
   <w16cid:commentId w16cid:paraId="4BE2C4AC" w16cid:durableId="3CE12808"/>
   <w16cid:commentId w16cid:paraId="6DE6B53B" w16cid:durableId="25613EB9"/>
   <w16cid:commentId w16cid:paraId="243DA3ED" w16cid:durableId="16D152E9"/>

</xml_diff>